<commit_message>
chore(repo): snapshot completo — entregables ago-sep, generadores y prep de Perfetti
Vuelca al repo todo el trabajo local acumulado desde el último snapshot:

- output/: paquetes diarios de 2026-07-07 a 2026-09-09 (CVs, cartas, landings,
  decks), perfil de LinkedIn, portfolio, CV_general y la guía de entrevista de
  Perfetti Van Melle (E-Commerce Executive Growth Markets).
- scripts/: ~100 generadores one-off _gen_*.py por oferta.
- career_ops/generators/images.py + config: generación de imágenes vía Google
  Gemini (gemini-3-pro-image), sustituye a Higgsfield. Claves nuevas
  documentadas en .env.example (solo placeholders).
- templates/: plantilla de CV compactada a 1 página + backup pre-compact.
- profile.yaml: gestión de equipo (diseñadora + social media exec) y ajustes.
- data/scored_jobs.json: scoring acumulado de las ofertas analizadas.

Co-Authored-By: Claude Opus 5 (1M context) <noreply@anthropic.com>
</commit_message>
<xml_diff>
--- a/templates/cv_paula_template.docx
+++ b/templates/cv_paula_template.docx
@@ -27,7 +27,7 @@
           </w:tcPr>
           <w:p>
             <w:pPr>
-              <w:spacing w:before="0" w:after="0"/>
+              <w:spacing w:before="0" w:after="20" w:line="220" w:lineRule="exact"/>
             </w:pPr>
             <w:r>
               <w:rPr>
@@ -41,7 +41,7 @@
           </w:p>
           <w:p>
             <w:pPr>
-              <w:spacing w:before="0" w:after="0"/>
+              <w:spacing w:before="0" w:after="20" w:line="220" w:lineRule="exact"/>
             </w:pPr>
             <w:r>
               <w:rPr>
@@ -55,7 +55,7 @@
           </w:p>
           <w:p>
             <w:pPr>
-              <w:spacing w:before="0" w:after="0"/>
+              <w:spacing w:before="0" w:after="20" w:line="220" w:lineRule="exact"/>
             </w:pPr>
             <w:r>
               <w:rPr>
@@ -69,7 +69,7 @@
           </w:p>
           <w:p>
             <w:pPr>
-              <w:spacing w:before="0" w:after="0"/>
+              <w:spacing w:before="0" w:after="20" w:line="220" w:lineRule="exact"/>
             </w:pPr>
             <w:r>
               <w:rPr>
@@ -88,6 +88,7 @@
           </w:tcPr>
           <w:p>
             <w:pPr>
+              <w:spacing w:before="0" w:after="20" w:line="220" w:lineRule="exact"/>
               <w:jc w:val="right"/>
             </w:pPr>
             <w:r>
@@ -130,7 +131,7 @@
     </w:tbl>
     <w:p>
       <w:pPr>
-        <w:spacing w:before="280" w:after="80"/>
+        <w:spacing w:before="80" w:after="40" w:line="230" w:lineRule="exact"/>
       </w:pPr>
       <w:r>
         <w:rPr>
@@ -144,7 +145,7 @@
     </w:p>
     <w:p>
       <w:pPr>
-        <w:spacing w:before="120" w:after="120"/>
+        <w:spacing w:before="0" w:after="0" w:line="60" w:lineRule="exact"/>
         <w:pBdr>
           <w:bottom w:val="single" w:sz="4" w:space="1" w:color="CCCCCC"/>
         </w:pBdr>
@@ -152,7 +153,7 @@
     </w:p>
     <w:p>
       <w:pPr>
-        <w:spacing w:before="0" w:after="80" w:line="280" w:lineRule="exact"/>
+        <w:spacing w:before="80" w:after="40" w:line="230" w:lineRule="exact"/>
       </w:pPr>
       <w:r>
         <w:rPr>
@@ -166,7 +167,7 @@
     </w:p>
     <w:p>
       <w:pPr>
-        <w:spacing w:before="280" w:after="80"/>
+        <w:spacing w:before="80" w:after="40" w:line="230" w:lineRule="exact"/>
       </w:pPr>
       <w:r>
         <w:rPr>
@@ -180,7 +181,7 @@
     </w:p>
     <w:p>
       <w:pPr>
-        <w:spacing w:before="120" w:after="120"/>
+        <w:spacing w:before="0" w:after="0" w:line="60" w:lineRule="exact"/>
         <w:pBdr>
           <w:bottom w:val="single" w:sz="4" w:space="1" w:color="CCCCCC"/>
         </w:pBdr>
@@ -199,19 +200,20 @@
           <w:insideH w:val="none" w:sz="0" w:space="0" w:color="auto"/>
           <w:insideV w:val="none" w:sz="0" w:space="0" w:color="auto"/>
         </w:tblBorders>
+        <w:tblLayout w:type="fixed"/>
       </w:tblPr>
       <w:tblGrid>
-        <w:gridCol w:w="4986"/>
-        <w:gridCol w:w="4986"/>
+        <w:gridCol w:w="7560"/>
+        <w:gridCol w:w="2808"/>
       </w:tblGrid>
       <w:tr>
         <w:tc>
           <w:tcPr>
-            <w:tcW w:type="dxa" w:w="6803"/>
+            <w:tcW w:type="dxa" w:w="7560"/>
           </w:tcPr>
           <w:p>
             <w:pPr>
-              <w:spacing w:before="160" w:after="0"/>
+              <w:spacing w:before="0" w:after="20" w:line="220" w:lineRule="exact"/>
             </w:pPr>
             <w:r>
               <w:rPr>
@@ -226,11 +228,11 @@
         </w:tc>
         <w:tc>
           <w:tcPr>
-            <w:tcW w:type="dxa" w:w="2835"/>
+            <w:tcW w:type="dxa" w:w="2808"/>
           </w:tcPr>
           <w:p>
             <w:pPr>
-              <w:spacing w:before="160" w:after="0"/>
+              <w:spacing w:before="0" w:after="20" w:line="220" w:lineRule="exact"/>
               <w:jc w:val="right"/>
             </w:pPr>
             <w:r>
@@ -248,7 +250,7 @@
     </w:tbl>
     <w:p>
       <w:pPr>
-        <w:spacing w:before="0" w:after="80"/>
+        <w:spacing w:before="80" w:after="40" w:line="230" w:lineRule="exact"/>
       </w:pPr>
       <w:r>
         <w:rPr>
@@ -262,7 +264,7 @@
     </w:p>
     <w:p>
       <w:pPr>
-        <w:spacing w:before="0" w:after="40" w:line="260" w:lineRule="exact"/>
+        <w:spacing w:before="80" w:after="40" w:line="230" w:lineRule="exact"/>
       </w:pPr>
       <w:r>
         <w:rPr>
@@ -287,19 +289,20 @@
           <w:insideH w:val="none" w:sz="0" w:space="0" w:color="auto"/>
           <w:insideV w:val="none" w:sz="0" w:space="0" w:color="auto"/>
         </w:tblBorders>
+        <w:tblLayout w:type="fixed"/>
       </w:tblPr>
       <w:tblGrid>
-        <w:gridCol w:w="4986"/>
-        <w:gridCol w:w="4986"/>
+        <w:gridCol w:w="7560"/>
+        <w:gridCol w:w="2808"/>
       </w:tblGrid>
       <w:tr>
         <w:tc>
           <w:tcPr>
-            <w:tcW w:type="dxa" w:w="6803"/>
+            <w:tcW w:type="dxa" w:w="7560"/>
           </w:tcPr>
           <w:p>
             <w:pPr>
-              <w:spacing w:before="160" w:after="0"/>
+              <w:spacing w:before="0" w:after="20" w:line="220" w:lineRule="exact"/>
             </w:pPr>
             <w:r>
               <w:rPr>
@@ -314,11 +317,11 @@
         </w:tc>
         <w:tc>
           <w:tcPr>
-            <w:tcW w:type="dxa" w:w="2835"/>
+            <w:tcW w:type="dxa" w:w="2808"/>
           </w:tcPr>
           <w:p>
             <w:pPr>
-              <w:spacing w:before="160" w:after="0"/>
+              <w:spacing w:before="0" w:after="20" w:line="220" w:lineRule="exact"/>
               <w:jc w:val="right"/>
             </w:pPr>
             <w:r>
@@ -336,7 +339,7 @@
     </w:tbl>
     <w:p>
       <w:pPr>
-        <w:spacing w:before="0" w:after="80"/>
+        <w:spacing w:before="80" w:after="40" w:line="230" w:lineRule="exact"/>
       </w:pPr>
       <w:r>
         <w:rPr>
@@ -350,7 +353,7 @@
     </w:p>
     <w:p>
       <w:pPr>
-        <w:spacing w:before="0" w:after="40" w:line="260" w:lineRule="exact"/>
+        <w:spacing w:before="80" w:after="40" w:line="230" w:lineRule="exact"/>
       </w:pPr>
       <w:r>
         <w:rPr>
@@ -375,19 +378,20 @@
           <w:insideH w:val="none" w:sz="0" w:space="0" w:color="auto"/>
           <w:insideV w:val="none" w:sz="0" w:space="0" w:color="auto"/>
         </w:tblBorders>
+        <w:tblLayout w:type="fixed"/>
       </w:tblPr>
       <w:tblGrid>
-        <w:gridCol w:w="4986"/>
-        <w:gridCol w:w="4986"/>
+        <w:gridCol w:w="7560"/>
+        <w:gridCol w:w="2808"/>
       </w:tblGrid>
       <w:tr>
         <w:tc>
           <w:tcPr>
-            <w:tcW w:type="dxa" w:w="6803"/>
+            <w:tcW w:type="dxa" w:w="7560"/>
           </w:tcPr>
           <w:p>
             <w:pPr>
-              <w:spacing w:before="160" w:after="0"/>
+              <w:spacing w:before="0" w:after="20" w:line="220" w:lineRule="exact"/>
             </w:pPr>
             <w:r>
               <w:rPr>
@@ -402,11 +406,11 @@
         </w:tc>
         <w:tc>
           <w:tcPr>
-            <w:tcW w:type="dxa" w:w="2835"/>
+            <w:tcW w:type="dxa" w:w="2808"/>
           </w:tcPr>
           <w:p>
             <w:pPr>
-              <w:spacing w:before="160" w:after="0"/>
+              <w:spacing w:before="0" w:after="20" w:line="220" w:lineRule="exact"/>
               <w:jc w:val="right"/>
             </w:pPr>
             <w:r>
@@ -424,7 +428,7 @@
     </w:tbl>
     <w:p>
       <w:pPr>
-        <w:spacing w:before="0" w:after="80"/>
+        <w:spacing w:before="80" w:after="40" w:line="230" w:lineRule="exact"/>
       </w:pPr>
       <w:r>
         <w:rPr>
@@ -438,7 +442,7 @@
     </w:p>
     <w:p>
       <w:pPr>
-        <w:spacing w:before="0" w:after="40" w:line="260" w:lineRule="exact"/>
+        <w:spacing w:before="80" w:after="40" w:line="230" w:lineRule="exact"/>
       </w:pPr>
       <w:r>
         <w:rPr>
@@ -463,19 +467,20 @@
           <w:insideH w:val="none" w:sz="0" w:space="0" w:color="auto"/>
           <w:insideV w:val="none" w:sz="0" w:space="0" w:color="auto"/>
         </w:tblBorders>
+        <w:tblLayout w:type="fixed"/>
       </w:tblPr>
       <w:tblGrid>
-        <w:gridCol w:w="4986"/>
-        <w:gridCol w:w="4986"/>
+        <w:gridCol w:w="7560"/>
+        <w:gridCol w:w="2808"/>
       </w:tblGrid>
       <w:tr>
         <w:tc>
           <w:tcPr>
-            <w:tcW w:type="dxa" w:w="6803"/>
+            <w:tcW w:type="dxa" w:w="7560"/>
           </w:tcPr>
           <w:p>
             <w:pPr>
-              <w:spacing w:before="160" w:after="0"/>
+              <w:spacing w:before="0" w:after="20" w:line="220" w:lineRule="exact"/>
             </w:pPr>
             <w:r>
               <w:rPr>
@@ -490,11 +495,11 @@
         </w:tc>
         <w:tc>
           <w:tcPr>
-            <w:tcW w:type="dxa" w:w="2835"/>
+            <w:tcW w:type="dxa" w:w="2808"/>
           </w:tcPr>
           <w:p>
             <w:pPr>
-              <w:spacing w:before="160" w:after="0"/>
+              <w:spacing w:before="0" w:after="20" w:line="220" w:lineRule="exact"/>
               <w:jc w:val="right"/>
             </w:pPr>
             <w:r>
@@ -512,7 +517,7 @@
     </w:tbl>
     <w:p>
       <w:pPr>
-        <w:spacing w:before="0" w:after="80"/>
+        <w:spacing w:before="80" w:after="40" w:line="230" w:lineRule="exact"/>
       </w:pPr>
       <w:r>
         <w:rPr>
@@ -526,7 +531,7 @@
     </w:p>
     <w:p>
       <w:pPr>
-        <w:spacing w:before="0" w:after="40" w:line="260" w:lineRule="exact"/>
+        <w:spacing w:before="80" w:after="40" w:line="230" w:lineRule="exact"/>
       </w:pPr>
       <w:r>
         <w:rPr>
@@ -540,7 +545,7 @@
     </w:p>
     <w:p>
       <w:pPr>
-        <w:spacing w:before="280" w:after="80"/>
+        <w:spacing w:before="80" w:after="40" w:line="230" w:lineRule="exact"/>
       </w:pPr>
       <w:r>
         <w:rPr>
@@ -554,7 +559,7 @@
     </w:p>
     <w:p>
       <w:pPr>
-        <w:spacing w:before="120" w:after="120"/>
+        <w:spacing w:before="0" w:after="0" w:line="60" w:lineRule="exact"/>
         <w:pBdr>
           <w:bottom w:val="single" w:sz="4" w:space="1" w:color="CCCCCC"/>
         </w:pBdr>
@@ -573,20 +578,21 @@
           <w:insideH w:val="none" w:sz="0" w:space="0" w:color="auto"/>
           <w:insideV w:val="none" w:sz="0" w:space="0" w:color="auto"/>
         </w:tblBorders>
+        <w:tblLayout w:type="fixed"/>
       </w:tblPr>
       <w:tblGrid>
-        <w:gridCol w:w="4986"/>
-        <w:gridCol w:w="4986"/>
+        <w:gridCol w:w="2232"/>
+        <w:gridCol w:w="8136"/>
       </w:tblGrid>
       <w:tr>
         <w:tc>
           <w:tcPr>
-            <w:tcW w:type="dxa" w:w="1701"/>
+            <w:tcW w:type="dxa" w:w="2232"/>
             <w:tcW w:w="1700" w:type="dxa"/>
           </w:tcPr>
           <w:p>
             <w:pPr>
-              <w:spacing w:before="40" w:after="40"/>
+              <w:spacing w:before="0" w:after="20" w:line="220" w:lineRule="exact"/>
             </w:pPr>
             <w:r>
               <w:rPr>
@@ -601,12 +607,12 @@
         </w:tc>
         <w:tc>
           <w:tcPr>
-            <w:tcW w:type="dxa" w:w="7937"/>
+            <w:tcW w:type="dxa" w:w="8136"/>
             <w:tcW w:w="7937" w:type="dxa"/>
           </w:tcPr>
           <w:p>
             <w:pPr>
-              <w:spacing w:before="40" w:after="40"/>
+              <w:spacing w:before="0" w:after="20" w:line="220" w:lineRule="exact"/>
             </w:pPr>
             <w:r>
               <w:rPr>
@@ -634,20 +640,21 @@
           <w:insideH w:val="none" w:sz="0" w:space="0" w:color="auto"/>
           <w:insideV w:val="none" w:sz="0" w:space="0" w:color="auto"/>
         </w:tblBorders>
+        <w:tblLayout w:type="fixed"/>
       </w:tblPr>
       <w:tblGrid>
-        <w:gridCol w:w="4986"/>
-        <w:gridCol w:w="4986"/>
+        <w:gridCol w:w="2232"/>
+        <w:gridCol w:w="8136"/>
       </w:tblGrid>
       <w:tr>
         <w:tc>
           <w:tcPr>
-            <w:tcW w:type="dxa" w:w="1701"/>
+            <w:tcW w:type="dxa" w:w="2232"/>
             <w:tcW w:w="1700" w:type="dxa"/>
           </w:tcPr>
           <w:p>
             <w:pPr>
-              <w:spacing w:before="40" w:after="40"/>
+              <w:spacing w:before="0" w:after="20" w:line="220" w:lineRule="exact"/>
             </w:pPr>
             <w:r>
               <w:rPr>
@@ -662,12 +669,12 @@
         </w:tc>
         <w:tc>
           <w:tcPr>
-            <w:tcW w:type="dxa" w:w="7937"/>
+            <w:tcW w:type="dxa" w:w="8136"/>
             <w:tcW w:w="7937" w:type="dxa"/>
           </w:tcPr>
           <w:p>
             <w:pPr>
-              <w:spacing w:before="40" w:after="40"/>
+              <w:spacing w:before="0" w:after="20" w:line="220" w:lineRule="exact"/>
             </w:pPr>
             <w:r>
               <w:rPr>
@@ -695,20 +702,21 @@
           <w:insideH w:val="none" w:sz="0" w:space="0" w:color="auto"/>
           <w:insideV w:val="none" w:sz="0" w:space="0" w:color="auto"/>
         </w:tblBorders>
+        <w:tblLayout w:type="fixed"/>
       </w:tblPr>
       <w:tblGrid>
-        <w:gridCol w:w="4986"/>
-        <w:gridCol w:w="4986"/>
+        <w:gridCol w:w="2232"/>
+        <w:gridCol w:w="8136"/>
       </w:tblGrid>
       <w:tr>
         <w:tc>
           <w:tcPr>
-            <w:tcW w:type="dxa" w:w="1701"/>
+            <w:tcW w:type="dxa" w:w="2232"/>
             <w:tcW w:w="1700" w:type="dxa"/>
           </w:tcPr>
           <w:p>
             <w:pPr>
-              <w:spacing w:before="40" w:after="40"/>
+              <w:spacing w:before="0" w:after="20" w:line="220" w:lineRule="exact"/>
             </w:pPr>
             <w:r>
               <w:rPr>
@@ -723,12 +731,12 @@
         </w:tc>
         <w:tc>
           <w:tcPr>
-            <w:tcW w:type="dxa" w:w="7937"/>
+            <w:tcW w:type="dxa" w:w="8136"/>
             <w:tcW w:w="7937" w:type="dxa"/>
           </w:tcPr>
           <w:p>
             <w:pPr>
-              <w:spacing w:before="40" w:after="40"/>
+              <w:spacing w:before="0" w:after="20" w:line="220" w:lineRule="exact"/>
             </w:pPr>
             <w:r>
               <w:rPr>
@@ -756,20 +764,21 @@
           <w:insideH w:val="none" w:sz="0" w:space="0" w:color="auto"/>
           <w:insideV w:val="none" w:sz="0" w:space="0" w:color="auto"/>
         </w:tblBorders>
+        <w:tblLayout w:type="fixed"/>
       </w:tblPr>
       <w:tblGrid>
-        <w:gridCol w:w="4986"/>
-        <w:gridCol w:w="4986"/>
+        <w:gridCol w:w="2232"/>
+        <w:gridCol w:w="8136"/>
       </w:tblGrid>
       <w:tr>
         <w:tc>
           <w:tcPr>
-            <w:tcW w:type="dxa" w:w="1701"/>
+            <w:tcW w:type="dxa" w:w="2232"/>
             <w:tcW w:w="1700" w:type="dxa"/>
           </w:tcPr>
           <w:p>
             <w:pPr>
-              <w:spacing w:before="40" w:after="40"/>
+              <w:spacing w:before="0" w:after="20" w:line="220" w:lineRule="exact"/>
             </w:pPr>
             <w:r>
               <w:rPr>
@@ -784,12 +793,12 @@
         </w:tc>
         <w:tc>
           <w:tcPr>
-            <w:tcW w:type="dxa" w:w="7937"/>
+            <w:tcW w:type="dxa" w:w="8136"/>
             <w:tcW w:w="7937" w:type="dxa"/>
           </w:tcPr>
           <w:p>
             <w:pPr>
-              <w:spacing w:before="40" w:after="40"/>
+              <w:spacing w:before="0" w:after="20" w:line="220" w:lineRule="exact"/>
             </w:pPr>
             <w:r>
               <w:rPr>
@@ -817,20 +826,21 @@
           <w:insideH w:val="none" w:sz="0" w:space="0" w:color="auto"/>
           <w:insideV w:val="none" w:sz="0" w:space="0" w:color="auto"/>
         </w:tblBorders>
+        <w:tblLayout w:type="fixed"/>
       </w:tblPr>
       <w:tblGrid>
-        <w:gridCol w:w="4986"/>
-        <w:gridCol w:w="4986"/>
+        <w:gridCol w:w="2232"/>
+        <w:gridCol w:w="8136"/>
       </w:tblGrid>
       <w:tr>
         <w:tc>
           <w:tcPr>
-            <w:tcW w:type="dxa" w:w="1701"/>
+            <w:tcW w:type="dxa" w:w="2232"/>
             <w:tcW w:w="1700" w:type="dxa"/>
           </w:tcPr>
           <w:p>
             <w:pPr>
-              <w:spacing w:before="40" w:after="40"/>
+              <w:spacing w:before="0" w:after="20" w:line="220" w:lineRule="exact"/>
             </w:pPr>
             <w:r>
               <w:rPr>
@@ -845,12 +855,12 @@
         </w:tc>
         <w:tc>
           <w:tcPr>
-            <w:tcW w:type="dxa" w:w="7937"/>
+            <w:tcW w:type="dxa" w:w="8136"/>
             <w:tcW w:w="7937" w:type="dxa"/>
           </w:tcPr>
           <w:p>
             <w:pPr>
-              <w:spacing w:before="40" w:after="40"/>
+              <w:spacing w:before="0" w:after="20" w:line="220" w:lineRule="exact"/>
             </w:pPr>
             <w:r>
               <w:rPr>
@@ -867,7 +877,7 @@
     </w:tbl>
     <w:p>
       <w:pPr>
-        <w:spacing w:before="280" w:after="80"/>
+        <w:spacing w:before="80" w:after="40" w:line="230" w:lineRule="exact"/>
       </w:pPr>
       <w:r>
         <w:rPr>
@@ -881,7 +891,7 @@
     </w:p>
     <w:p>
       <w:pPr>
-        <w:spacing w:before="120" w:after="120"/>
+        <w:spacing w:before="0" w:after="0" w:line="60" w:lineRule="exact"/>
         <w:pBdr>
           <w:bottom w:val="single" w:sz="4" w:space="1" w:color="CCCCCC"/>
         </w:pBdr>
@@ -900,19 +910,20 @@
           <w:insideH w:val="none" w:sz="0" w:space="0" w:color="auto"/>
           <w:insideV w:val="none" w:sz="0" w:space="0" w:color="auto"/>
         </w:tblBorders>
+        <w:tblLayout w:type="fixed"/>
       </w:tblPr>
       <w:tblGrid>
-        <w:gridCol w:w="4986"/>
-        <w:gridCol w:w="4986"/>
+        <w:gridCol w:w="7776"/>
+        <w:gridCol w:w="2592"/>
       </w:tblGrid>
       <w:tr>
         <w:tc>
           <w:tcPr>
-            <w:tcW w:type="dxa" w:w="6803"/>
+            <w:tcW w:type="dxa" w:w="7776"/>
           </w:tcPr>
           <w:p>
             <w:pPr>
-              <w:spacing w:before="0" w:after="0"/>
+              <w:spacing w:before="0" w:after="20" w:line="220" w:lineRule="exact"/>
             </w:pPr>
             <w:r>
               <w:rPr>
@@ -927,11 +938,11 @@
         </w:tc>
         <w:tc>
           <w:tcPr>
-            <w:tcW w:type="dxa" w:w="2835"/>
+            <w:tcW w:type="dxa" w:w="2592"/>
           </w:tcPr>
           <w:p>
             <w:pPr>
-              <w:spacing w:before="0" w:after="0"/>
+              <w:spacing w:before="0" w:after="20" w:line="220" w:lineRule="exact"/>
               <w:jc w:val="right"/>
             </w:pPr>
             <w:r>
@@ -949,7 +960,7 @@
     </w:tbl>
     <w:p>
       <w:pPr>
-        <w:spacing w:before="0" w:after="20"/>
+        <w:spacing w:before="80" w:after="40" w:line="230" w:lineRule="exact"/>
       </w:pPr>
       <w:r>
         <w:rPr>
@@ -963,7 +974,7 @@
     </w:p>
     <w:p>
       <w:pPr>
-        <w:spacing w:before="0" w:after="0"/>
+        <w:spacing w:before="80" w:after="40" w:line="230" w:lineRule="exact"/>
       </w:pPr>
       <w:r>
         <w:rPr>
@@ -977,7 +988,7 @@
     </w:p>
     <w:p>
       <w:pPr>
-        <w:spacing w:before="280" w:after="80"/>
+        <w:spacing w:before="80" w:after="40" w:line="230" w:lineRule="exact"/>
       </w:pPr>
       <w:r>
         <w:rPr>
@@ -991,7 +1002,7 @@
     </w:p>
     <w:p>
       <w:pPr>
-        <w:spacing w:before="120" w:after="120"/>
+        <w:spacing w:before="0" w:after="0" w:line="60" w:lineRule="exact"/>
         <w:pBdr>
           <w:bottom w:val="single" w:sz="4" w:space="1" w:color="CCCCCC"/>
         </w:pBdr>
@@ -1024,7 +1035,7 @@
           </w:tcPr>
           <w:p>
             <w:pPr>
-              <w:spacing w:before="0" w:after="0"/>
+              <w:spacing w:before="0" w:after="20" w:line="220" w:lineRule="exact"/>
             </w:pPr>
             <w:r>
               <w:rPr>
@@ -1043,7 +1054,7 @@
           </w:tcPr>
           <w:p>
             <w:pPr>
-              <w:spacing w:before="0" w:after="0"/>
+              <w:spacing w:before="0" w:after="20" w:line="220" w:lineRule="exact"/>
             </w:pPr>
             <w:r>
               <w:rPr>
@@ -1062,7 +1073,7 @@
           </w:tcPr>
           <w:p>
             <w:pPr>
-              <w:spacing w:before="0" w:after="0"/>
+              <w:spacing w:before="0" w:after="20" w:line="220" w:lineRule="exact"/>
             </w:pPr>
             <w:r>
               <w:rPr>
@@ -1081,7 +1092,7 @@
           </w:tcPr>
           <w:p>
             <w:pPr>
-              <w:spacing w:before="0" w:after="0"/>
+              <w:spacing w:before="0" w:after="20" w:line="220" w:lineRule="exact"/>
             </w:pPr>
             <w:r>
               <w:rPr>
@@ -1098,7 +1109,7 @@
     </w:tbl>
     <w:sectPr>
       <w:pgSz w:w="12240" w:h="15840"/>
-      <w:pgMar w:top="850" w:right="1134" w:bottom="680" w:left="1134" w:header="720" w:footer="720" w:gutter="0"/>
+      <w:pgMar w:top="648" w:right="792" w:bottom="547" w:left="792" w:header="720" w:footer="720" w:gutter="0"/>
       <w:cols w:space="720"/>
       <w:docGrid w:linePitch="360"/>
     </w:sectPr>

</xml_diff>